<commit_message>
update information in the document
</commit_message>
<xml_diff>
--- a/docs/development-planning.docx
+++ b/docs/development-planning.docx
@@ -5527,7 +5527,7 @@
           <w:szCs w:val="29"/>
           <w:rtl w:val="0"/>
         </w:rPr>
-        <w:t xml:space="preserve">GET /api/patient/search?first_name=สมชาย&amp;date_of_birth=25/10/1995&amp;page=1&amp;page_size=10&amp;sort_by=created_at&amp;sort_order=DESC</w:t>
+        <w:t xml:space="preserve">GET /api/patient/search?first_name=สมชาย&amp;date_of_birth=25/10/1995&amp;page=1&amp;page_size=10&amp;sort_by=patient_hn&amp;sort_order=asc</w:t>
       </w:r>
     </w:p>
     <w:p>
@@ -8209,43 +8209,7 @@
                 <w:szCs w:val="29"/>
                 <w:rtl w:val="0"/>
               </w:rPr>
-              <w:t xml:space="preserve">ทิศทางการเรียงลำดับ (</w:t>
-            </w:r>
-            <w:r>
-              <w:rPr>
-                <w:rFonts w:ascii="Angsana New" w:cs="Angsana New" w:eastAsia="Angsana New" w:hAnsi="Angsana New"/>
-                <w:sz w:val="29"/>
-                <w:szCs w:val="29"/>
-                <w:rtl w:val="0"/>
-              </w:rPr>
-              <w:t xml:space="preserve">ASC</w:t>
-            </w:r>
-            <w:r>
-              <w:rPr>
-                <w:rFonts w:ascii="Angsana New" w:cs="Angsana New" w:eastAsia="Angsana New" w:hAnsi="Angsana New"/>
-                <w:sz w:val="29"/>
-                <w:szCs w:val="29"/>
-                <w:rtl w:val="0"/>
-              </w:rPr>
-              <w:t xml:space="preserve"> หรือ </w:t>
-            </w:r>
-            <w:r>
-              <w:rPr>
-                <w:rFonts w:ascii="Angsana New" w:cs="Angsana New" w:eastAsia="Angsana New" w:hAnsi="Angsana New"/>
-                <w:sz w:val="29"/>
-                <w:szCs w:val="29"/>
-                <w:rtl w:val="0"/>
-              </w:rPr>
-              <w:t xml:space="preserve">DESC</w:t>
-            </w:r>
-            <w:r>
-              <w:rPr>
-                <w:rFonts w:ascii="Angsana New" w:cs="Angsana New" w:eastAsia="Angsana New" w:hAnsi="Angsana New"/>
-                <w:sz w:val="29"/>
-                <w:szCs w:val="29"/>
-                <w:rtl w:val="0"/>
-              </w:rPr>
-              <w:t xml:space="preserve">)</w:t>
+              <w:t xml:space="preserve">ทิศทางการเรียงลำดับ (asc หรือ desc)</w:t>
             </w:r>
           </w:p>
         </w:tc>

</xml_diff>